<commit_message>
docs: esclarecer métricas e percentuais
</commit_message>
<xml_diff>
--- a/docs/dw_canada.docx
+++ b/docs/dw_canada.docx
@@ -583,7 +583,7 @@
                 <w:rFonts w:ascii="Times New Roman" w:hAnsi="Times New Roman" w:cs="Times New Roman"/>
                 <w:sz w:val="20"/>
               </w:rPr>
-              <w:t>Apresentar o modelo Star Schema, os dicionários e o script SQL que permitem responder às 10 perguntas do plano.</w:t>
+              <w:t>Integrar os três conjuntos de dados em um modelo dimensional capaz de responder às 10 perguntas analíticas definidas, contemplando as 13 províncias e territórios canadenses sempre que houver dados disponíveis na fonte.</w:t>
             </w:r>
           </w:p>
         </w:tc>
@@ -7661,7 +7661,7 @@
           <w:i w:val="0"/>
           <w:sz w:val="24"/>
         </w:rPr>
-        <w:t>Participação brasileira (%) e percentuais habitacionais não são armazenados; são calculados na camada de apresentação (fatos não aditivos).</w:t>
+        <w:t>A participação brasileira (%) não é armazenada: é calculada na camada de apresentação a partir das contagens de brasileiros e do total de imigrantes. Os percentuais habitacionais fornecidos oficialmente pelo Statistics Canada são armazenados em fato_habitacao.vl_medida, identificados por dim_indicador_habitacao.tp_medida = 'PERCENTUAL', e tratados como medidas não aditivas.</w:t>
       </w:r>
     </w:p>
     <w:p>

</xml_diff>